<commit_message>
Rebuild logo mark as an actual millstone, not a compass/star
The first pass used tapered pointed blades, which read as a compass
rose/star. Rebuilt the mark generator around straight radial grooves
(primary per sector + fanning secondary grooves) inside a plain circular
silhouette with a small center spindle hole — matching how a real
dressed millstone face looks, simplified into clean brand line work.
Regenerated all 6 concepts, guidelines doc, and letterhead/business card
mockups; updated README/doc terminology from "blade" to "sector/groove".
</commit_message>
<xml_diff>
--- a/branding/Brand-Guidelines.docx
+++ b/branding/Brand-Guidelines.docx
@@ -992,7 +992,7 @@
           <w:sz w:val="22"/>
           <w:szCs w:val="22"/>
         </w:rPr>
-        <w:t xml:space="preserve">The recommended starting point is Concept 2 (page 6) — an 8-blade combination lockup — for general use: business cards, letterhead, email signatures, and slide decks. Concept 1 (dense 9-blade) is built as a standalone icon for favicons and app icons where the wordmark won't appear. Review all six on the following pages and tell me which to carry forward — the rest are provided as alternates or for A/B use across sub-brands or product lines.</w:t>
+        <w:t xml:space="preserve">The recommended starting point is Concept 2 (page 6) — an 8-sector combination lockup — for general use: business cards, letterhead, email signatures, and slide decks. Concept 3 (10 sectors, fine grooves) is built as a standalone icon for favicons and app icons where a finer, more literal stone texture reads well at small size. Review all six on the following pages and tell me which to carry forward — the rest are provided as alternates or for A/B use across sub-brands or product lines.</w:t>
       </w:r>
     </w:p>
     <w:p>
@@ -1014,7 +1014,7 @@
           <w:sz w:val="22"/>
           <w:szCs w:val="22"/>
         </w:rPr>
-        <w:t xml:space="preserve">Keep clear space around the mark equal to at least the radius of its center hub circle on all sides — no text, edges, or other graphics inside that margin.</w:t>
+        <w:t xml:space="preserve">Keep clear space around the mark equal to at least the radius of its outer rim circle on all sides — no text, edges, or other graphics inside that margin.</w:t>
       </w:r>
     </w:p>
     <w:p>
@@ -1104,7 +1104,7 @@
           <w:sz w:val="22"/>
           <w:szCs w:val="22"/>
         </w:rPr>
-        <w:t xml:space="preserve">Use the single gold accent only for the center hub or a supporting rule/divider — never as the dominant blade color.</w:t>
+        <w:t xml:space="preserve">Use the single gold accent only for the center spindle-hole ring or a supporting rule/divider — never as the dominant groove color.</w:t>
       </w:r>
     </w:p>
     <w:p>
@@ -1149,7 +1149,7 @@
           <w:sz w:val="22"/>
           <w:szCs w:val="22"/>
         </w:rPr>
-        <w:t xml:space="preserve">Don't recolor the blades in multiple colors at once, add drop shadows/bevels, or stretch the mark disproportionately.</w:t>
+        <w:t xml:space="preserve">Don't recolor the grooves in multiple colors at once, add drop shadows/bevels, or stretch the mark disproportionately.</w:t>
       </w:r>
     </w:p>
     <w:p>
@@ -1185,7 +1185,7 @@
           <w:sz w:val="22"/>
           <w:szCs w:val="22"/>
         </w:rPr>
-        <w:t xml:space="preserve">Don't rotate the mark — its blade angles are fixed per concept.</w:t>
+        <w:t xml:space="preserve">Don't rotate the mark — its sector angles are fixed per concept.</w:t>
       </w:r>
     </w:p>
     <w:p>
@@ -1212,7 +1212,7 @@
           <w:sz w:val="22"/>
           <w:szCs w:val="22"/>
         </w:rPr>
-        <w:t xml:space="preserve">Each concept is shown on both a light and a dark background to confirm it holds up in both contexts. Blade count and lockup style vary across the set per your direction — some read as a dense, literal pinwheel close to your reference image; others simplify toward a cleaner, more geometric mark; two work a monogram initial into the design.</w:t>
+        <w:t xml:space="preserve">The mark is a plain circular disc face divided into equal sectors by straight radiating grooves, with shorter secondary grooves fanning within each sector and a small center spindle hole — the actual structure of a dressed millstone face, not a pointed star or compass. Each concept varies sector count and groove density, from a fine, dense, literal texture close to your reference photo down to a clean, minimal mark; each is shown on both a light and a dark background to confirm it holds up in both contexts.</w:t>
       </w:r>
     </w:p>
     <w:p>
@@ -1226,7 +1226,7 @@
         <w:spacing w:after="150" w:before="300"/>
       </w:pPr>
       <w:r>
-        <w:t xml:space="preserve">Concept 1 — Icon-first, literal dense pinwheel (favicon / app-icon ready)</w:t>
+        <w:t xml:space="preserve">Concept 1 — Icon-first, 6 sectors / 3 secondary grooves (clean, moderate detail)</w:t>
       </w:r>
     </w:p>
     <w:p>
@@ -1285,7 +1285,7 @@
         <w:spacing w:after="150" w:before="300"/>
       </w:pPr>
       <w:r>
-        <w:t xml:space="preserve">Concept 2 — Combination lockup, side-by-side, 8-blade geometric</w:t>
+        <w:t xml:space="preserve">Concept 2 — Combination lockup, 8 sectors / 2 secondary grooves — recommended primary</w:t>
       </w:r>
     </w:p>
     <w:p>
@@ -1344,7 +1344,7 @@
         <w:spacing w:after="150" w:before="300"/>
       </w:pPr>
       <w:r>
-        <w:t xml:space="preserve">Concept 3 — Monogram mark (initial in spokes), side lockup, 6-blade clean</w:t>
+        <w:t xml:space="preserve">Concept 3 — Icon-first, 10 sectors / 2 secondary grooves (fine, dense texture)</w:t>
       </w:r>
     </w:p>
     <w:p>
@@ -1354,7 +1354,7 @@
       <w:r>
         <w:drawing>
           <wp:inline distT="0" distB="0" distL="0" distR="0">
-            <wp:extent cx="5905500" cy="1676400"/>
+            <wp:extent cx="5905500" cy="3848100"/>
             <wp:effectExtent t="0" r="0" b="0" l="0"/>
             <wp:docPr id="1" name="" descr="" title=""/>
             <wp:cNvGraphicFramePr>
@@ -1379,7 +1379,7 @@
                   <pic:spPr bwMode="auto">
                     <a:xfrm>
                       <a:off x="0" y="0"/>
-                      <a:ext cx="5905500" cy="1676400"/>
+                      <a:ext cx="5905500" cy="3848100"/>
                     </a:xfrm>
                     <a:prstGeom prst="rect">
                       <a:avLst/>
@@ -1403,7 +1403,7 @@
         <w:spacing w:after="150" w:before="300"/>
       </w:pPr>
       <w:r>
-        <w:t xml:space="preserve">Concept 4 — Icon-first stacked, mid-density 7-blade</w:t>
+        <w:t xml:space="preserve">Concept 4 — Icon-first stacked, 7 sectors / 3 secondary grooves</w:t>
       </w:r>
     </w:p>
     <w:p>
@@ -1462,7 +1462,7 @@
         <w:spacing w:after="150" w:before="300"/>
       </w:pPr>
       <w:r>
-        <w:t xml:space="preserve">Concept 5 — Combination lockup, side-by-side, 6-blade flat/minimal</w:t>
+        <w:t xml:space="preserve">Concept 5 — Combination lockup, 6 sectors / 1 secondary groove (minimal)</w:t>
       </w:r>
     </w:p>
     <w:p>
@@ -1521,7 +1521,7 @@
         <w:spacing w:after="150" w:before="300"/>
       </w:pPr>
       <w:r>
-        <w:t xml:space="preserve">Concept 6 — Monogram mark (initial at center), icon-first, dense 9-blade</w:t>
+        <w:t xml:space="preserve">Concept 6 — Icon-first, 9 sectors / 4 secondary grooves (densest, most literal)</w:t>
       </w:r>
     </w:p>
     <w:p>

</xml_diff>